<commit_message>
final updates on the word file
</commit_message>
<xml_diff>
--- a/project_updates/Adis_Delanovic_Final_Report.docx
+++ b/project_updates/Adis_Delanovic_Final_Report.docx
@@ -491,14 +491,46 @@
           <w:rFonts w:ascii="Times New Roman" w:hAnsi="Times New Roman" w:cs="Times New Roman"/>
           <w:szCs w:val="24"/>
         </w:rPr>
-        <w:t>AEA (Eastern) and ASO (Southern) tie for the highest score at 68.8, and are the only two regions in the High band</w:t>
-      </w:r>
+        <w:t xml:space="preserve">AEA (Eastern) and ASO (Southern) tie for the highest score at </w:t>
+      </w:r>
+      <w:proofErr w:type="gramStart"/>
       <w:r>
         <w:rPr>
           <w:rFonts w:ascii="Times New Roman" w:hAnsi="Times New Roman" w:cs="Times New Roman"/>
           <w:szCs w:val="24"/>
         </w:rPr>
-        <w:t>. The rpart model detected 57.5% of damaging test strikes, compared with 42.8% for SVM. Both models missed many damaging events, even though their overall accuracies were 86.0% and 92.4%.</w:t>
+        <w:t>68.8, and</w:t>
+      </w:r>
+      <w:proofErr w:type="gramEnd"/>
+      <w:r>
+        <w:rPr>
+          <w:rFonts w:ascii="Times New Roman" w:hAnsi="Times New Roman" w:cs="Times New Roman"/>
+          <w:szCs w:val="24"/>
+        </w:rPr>
+        <w:t xml:space="preserve"> are the only two regions in the High band</w:t>
+      </w:r>
+      <w:r>
+        <w:rPr>
+          <w:rFonts w:ascii="Times New Roman" w:hAnsi="Times New Roman" w:cs="Times New Roman"/>
+          <w:szCs w:val="24"/>
+        </w:rPr>
+        <w:t xml:space="preserve">. The </w:t>
+      </w:r>
+      <w:proofErr w:type="spellStart"/>
+      <w:r>
+        <w:rPr>
+          <w:rFonts w:ascii="Times New Roman" w:hAnsi="Times New Roman" w:cs="Times New Roman"/>
+          <w:szCs w:val="24"/>
+        </w:rPr>
+        <w:t>rpart</w:t>
+      </w:r>
+      <w:proofErr w:type="spellEnd"/>
+      <w:r>
+        <w:rPr>
+          <w:rFonts w:ascii="Times New Roman" w:hAnsi="Times New Roman" w:cs="Times New Roman"/>
+          <w:szCs w:val="24"/>
+        </w:rPr>
+        <w:t xml:space="preserve"> model detected 57.5% of damaging test strikes, compared with 42.8% for SVM. Both models missed many damaging events, even though their overall accuracies were 86.0% and 92.4%.</w:t>
       </w:r>
     </w:p>
     <w:p>
@@ -1224,7 +1256,35 @@
         <w:rPr>
           <w:rFonts w:ascii="Times New Roman" w:hAnsi="Times New Roman" w:cs="Times New Roman"/>
         </w:rPr>
-        <w:t xml:space="preserve">Groups include Bats, Deer, Other mammals, Reptiles &amp; amphibians, Raptors, Gulls &amp; terns, Waterfowl, Wading birds, Shorebirds, Seabirds, Doves &amp; pigeons, Corvids, Upland game birds, Perching birds, Other birds, Unknown and Unknown bird. Coots and rails are included in the broad Wading birds bucket, not Waterfowl. The existing Deer bucket also includes certain other large </w:t>
+        <w:t xml:space="preserve">Groups include Bats, Deer, Other mammals, Reptiles &amp; amphibians, Raptors, Gulls &amp; terns, Waterfowl, Wading birds, Shorebirds, Seabirds, Doves &amp; pigeons, Corvids, Upland game birds, Perching birds, </w:t>
+      </w:r>
+      <w:proofErr w:type="gramStart"/>
+      <w:r>
+        <w:rPr>
+          <w:rFonts w:ascii="Times New Roman" w:hAnsi="Times New Roman" w:cs="Times New Roman"/>
+        </w:rPr>
+        <w:t>Other</w:t>
+      </w:r>
+      <w:proofErr w:type="gramEnd"/>
+      <w:r>
+        <w:rPr>
+          <w:rFonts w:ascii="Times New Roman" w:hAnsi="Times New Roman" w:cs="Times New Roman"/>
+        </w:rPr>
+        <w:t xml:space="preserve"> birds, Unknown and Unknown bird. Coots and rails are included in the broad Wading </w:t>
+      </w:r>
+      <w:proofErr w:type="gramStart"/>
+      <w:r>
+        <w:rPr>
+          <w:rFonts w:ascii="Times New Roman" w:hAnsi="Times New Roman" w:cs="Times New Roman"/>
+        </w:rPr>
+        <w:t>birds</w:t>
+      </w:r>
+      <w:proofErr w:type="gramEnd"/>
+      <w:r>
+        <w:rPr>
+          <w:rFonts w:ascii="Times New Roman" w:hAnsi="Times New Roman" w:cs="Times New Roman"/>
+        </w:rPr>
+        <w:t xml:space="preserve"> bucket, not Waterfowl. The existing Deer bucket also includes certain other large </w:t>
       </w:r>
       <w:r>
         <w:rPr>
@@ -1252,6 +1312,37 @@
           <w:color w:val="000000" w:themeColor="text1"/>
         </w:rPr>
         <w:t>Four flight-phase groups</w:t>
+      </w:r>
+    </w:p>
+    <w:p>
+      <w:pPr>
+        <w:pStyle w:val="Caption"/>
+        <w:keepNext/>
+        <w:jc w:val="center"/>
+      </w:pPr>
+      <w:r>
+        <w:t xml:space="preserve">Table </w:t>
+      </w:r>
+      <w:r>
+        <w:fldChar w:fldCharType="begin"/>
+      </w:r>
+      <w:r>
+        <w:instrText xml:space="preserve"> SEQ Table \* ARABIC </w:instrText>
+      </w:r>
+      <w:r>
+        <w:fldChar w:fldCharType="separate"/>
+      </w:r>
+      <w:r>
+        <w:rPr>
+          <w:noProof/>
+        </w:rPr>
+        <w:t>1</w:t>
+      </w:r>
+      <w:r>
+        <w:fldChar w:fldCharType="end"/>
+      </w:r>
+      <w:r>
+        <w:t>. Grouping of original flight phases during data clean up.</w:t>
       </w:r>
     </w:p>
     <w:tbl>
@@ -1522,12 +1613,21 @@
                 <w:szCs w:val="18"/>
               </w:rPr>
             </w:pPr>
+            <w:proofErr w:type="gramStart"/>
             <w:r>
               <w:rPr>
                 <w:rFonts w:ascii="Times New Roman" w:hAnsi="Times New Roman" w:cs="Times New Roman"/>
                 <w:szCs w:val="18"/>
               </w:rPr>
-              <w:t>En Route; Local</w:t>
+              <w:t>En Route;</w:t>
+            </w:r>
+            <w:proofErr w:type="gramEnd"/>
+            <w:r>
+              <w:rPr>
+                <w:rFonts w:ascii="Times New Roman" w:hAnsi="Times New Roman" w:cs="Times New Roman"/>
+                <w:szCs w:val="18"/>
+              </w:rPr>
+              <w:t xml:space="preserve"> Local</w:t>
             </w:r>
           </w:p>
         </w:tc>
@@ -1623,20 +1723,6 @@
     </w:p>
     <w:p>
       <w:pPr>
-        <w:rPr>
-          <w:rFonts w:ascii="Times New Roman" w:hAnsi="Times New Roman" w:cs="Times New Roman"/>
-        </w:rPr>
-      </w:pPr>
-    </w:p>
-    <w:p>
-      <w:pPr>
-        <w:rPr>
-          <w:rFonts w:ascii="Times New Roman" w:hAnsi="Times New Roman" w:cs="Times New Roman"/>
-        </w:rPr>
-      </w:pPr>
-    </w:p>
-    <w:p>
-      <w:pPr>
         <w:pStyle w:val="Heading2"/>
         <w:rPr>
           <w:rFonts w:ascii="Times New Roman" w:hAnsi="Times New Roman" w:cs="Times New Roman"/>
@@ -1650,6 +1736,7 @@
           <w:sz w:val="32"/>
           <w:szCs w:val="32"/>
         </w:rPr>
+        <w:lastRenderedPageBreak/>
         <w:t>Seasonality and approximate migration periods</w:t>
       </w:r>
     </w:p>
@@ -1820,6 +1907,37 @@
         </w:rPr>
       </w:pPr>
     </w:p>
+    <w:p>
+      <w:pPr>
+        <w:pStyle w:val="Caption"/>
+        <w:keepNext/>
+        <w:jc w:val="center"/>
+      </w:pPr>
+      <w:r>
+        <w:t xml:space="preserve">Table </w:t>
+      </w:r>
+      <w:r>
+        <w:fldChar w:fldCharType="begin"/>
+      </w:r>
+      <w:r>
+        <w:instrText xml:space="preserve"> SEQ Table \* ARABIC </w:instrText>
+      </w:r>
+      <w:r>
+        <w:fldChar w:fldCharType="separate"/>
+      </w:r>
+      <w:r>
+        <w:rPr>
+          <w:noProof/>
+        </w:rPr>
+        <w:t>2</w:t>
+      </w:r>
+      <w:r>
+        <w:fldChar w:fldCharType="end"/>
+      </w:r>
+      <w:r>
+        <w:t>. Seasonal and approximate migration periods including % share of total.</w:t>
+      </w:r>
+    </w:p>
     <w:tbl>
       <w:tblPr>
         <w:tblStyle w:val="TableGrid"/>
@@ -2260,7 +2378,6 @@
                 <w:rFonts w:ascii="Times New Roman" w:hAnsi="Times New Roman" w:cs="Times New Roman"/>
                 <w:szCs w:val="18"/>
               </w:rPr>
-              <w:lastRenderedPageBreak/>
               <w:t>Fall migration</w:t>
             </w:r>
           </w:p>
@@ -2358,7 +2475,24 @@
           <w:rFonts w:ascii="Times New Roman" w:hAnsi="Times New Roman" w:cs="Times New Roman"/>
           <w:szCs w:val="24"/>
         </w:rPr>
-        <w:t>These are fixed, non-overlapping month bins, not observations of actual migration. June is assigned to spring migration so it is counted once. The periods have different lengths, and the data include nonmigratory birds and non-bird wildlife. The results therefore cannot establish that migration caused a specific strike.</w:t>
+        <w:lastRenderedPageBreak/>
+        <w:t xml:space="preserve">These are fixed, non-overlapping month bins, not observations of actual migration. June is assigned to spring </w:t>
+      </w:r>
+      <w:proofErr w:type="gramStart"/>
+      <w:r>
+        <w:rPr>
+          <w:rFonts w:ascii="Times New Roman" w:hAnsi="Times New Roman" w:cs="Times New Roman"/>
+          <w:szCs w:val="24"/>
+        </w:rPr>
+        <w:t>migration</w:t>
+      </w:r>
+      <w:proofErr w:type="gramEnd"/>
+      <w:r>
+        <w:rPr>
+          <w:rFonts w:ascii="Times New Roman" w:hAnsi="Times New Roman" w:cs="Times New Roman"/>
+          <w:szCs w:val="24"/>
+        </w:rPr>
+        <w:t xml:space="preserve"> so it is counted once. The periods have different lengths, and the data include nonmigratory birds and non-bird wildlife. The results therefore cannot establish that migration caused a specific strike.</w:t>
       </w:r>
     </w:p>
     <w:p>
@@ -2473,14 +2607,6 @@
     </w:p>
     <w:p>
       <w:pPr>
-        <w:rPr>
-          <w:rFonts w:ascii="Times New Roman" w:hAnsi="Times New Roman" w:cs="Times New Roman"/>
-          <w:szCs w:val="24"/>
-        </w:rPr>
-      </w:pPr>
-    </w:p>
-    <w:p>
-      <w:pPr>
         <w:pStyle w:val="Heading3"/>
         <w:jc w:val="both"/>
         <w:rPr>
@@ -2497,7 +2623,6 @@
           <w:bCs/>
           <w:color w:val="000000" w:themeColor="text1"/>
         </w:rPr>
-        <w:lastRenderedPageBreak/>
         <w:t>Seasonal pattern by time of day</w:t>
       </w:r>
     </w:p>
@@ -2624,6 +2749,7 @@
           <w:rFonts w:ascii="Times New Roman" w:hAnsi="Times New Roman" w:cs="Times New Roman"/>
           <w:szCs w:val="24"/>
         </w:rPr>
+        <w:lastRenderedPageBreak/>
         <w:t>The time-of-day seasonality chart normalizes each line within its own time category. A value of 10% for Night in one month means 10% of all night reports occurred then, not that 10% of that month’s reports were at night. This also explains why seasonal lines cannot be read as overall Day-versus-Night totals.</w:t>
       </w:r>
       <w:r>
@@ -2727,6 +2853,146 @@
     </w:p>
     <w:p>
       <w:pPr>
+        <w:rPr>
+          <w:rFonts w:ascii="Times New Roman" w:hAnsi="Times New Roman" w:cs="Times New Roman"/>
+        </w:rPr>
+      </w:pPr>
+    </w:p>
+    <w:p>
+      <w:pPr>
+        <w:rPr>
+          <w:rFonts w:ascii="Times New Roman" w:hAnsi="Times New Roman" w:cs="Times New Roman"/>
+        </w:rPr>
+      </w:pPr>
+    </w:p>
+    <w:p>
+      <w:pPr>
+        <w:rPr>
+          <w:rFonts w:ascii="Times New Roman" w:hAnsi="Times New Roman" w:cs="Times New Roman"/>
+        </w:rPr>
+      </w:pPr>
+    </w:p>
+    <w:p>
+      <w:pPr>
+        <w:rPr>
+          <w:rFonts w:ascii="Times New Roman" w:hAnsi="Times New Roman" w:cs="Times New Roman"/>
+        </w:rPr>
+      </w:pPr>
+    </w:p>
+    <w:p>
+      <w:pPr>
+        <w:rPr>
+          <w:rFonts w:ascii="Times New Roman" w:hAnsi="Times New Roman" w:cs="Times New Roman"/>
+        </w:rPr>
+      </w:pPr>
+    </w:p>
+    <w:p>
+      <w:pPr>
+        <w:rPr>
+          <w:rFonts w:ascii="Times New Roman" w:hAnsi="Times New Roman" w:cs="Times New Roman"/>
+        </w:rPr>
+      </w:pPr>
+    </w:p>
+    <w:p>
+      <w:pPr>
+        <w:rPr>
+          <w:rFonts w:ascii="Times New Roman" w:hAnsi="Times New Roman" w:cs="Times New Roman"/>
+        </w:rPr>
+      </w:pPr>
+    </w:p>
+    <w:p>
+      <w:pPr>
+        <w:rPr>
+          <w:rFonts w:ascii="Times New Roman" w:hAnsi="Times New Roman" w:cs="Times New Roman"/>
+        </w:rPr>
+      </w:pPr>
+    </w:p>
+    <w:p>
+      <w:pPr>
+        <w:rPr>
+          <w:rFonts w:ascii="Times New Roman" w:hAnsi="Times New Roman" w:cs="Times New Roman"/>
+        </w:rPr>
+      </w:pPr>
+    </w:p>
+    <w:p>
+      <w:pPr>
+        <w:rPr>
+          <w:rFonts w:ascii="Times New Roman" w:hAnsi="Times New Roman" w:cs="Times New Roman"/>
+        </w:rPr>
+      </w:pPr>
+    </w:p>
+    <w:p>
+      <w:pPr>
+        <w:rPr>
+          <w:rFonts w:ascii="Times New Roman" w:hAnsi="Times New Roman" w:cs="Times New Roman"/>
+        </w:rPr>
+      </w:pPr>
+    </w:p>
+    <w:p>
+      <w:pPr>
+        <w:rPr>
+          <w:rFonts w:ascii="Times New Roman" w:hAnsi="Times New Roman" w:cs="Times New Roman"/>
+        </w:rPr>
+      </w:pPr>
+    </w:p>
+    <w:p>
+      <w:pPr>
+        <w:rPr>
+          <w:rFonts w:ascii="Times New Roman" w:hAnsi="Times New Roman" w:cs="Times New Roman"/>
+        </w:rPr>
+      </w:pPr>
+    </w:p>
+    <w:p>
+      <w:pPr>
+        <w:rPr>
+          <w:rFonts w:ascii="Times New Roman" w:hAnsi="Times New Roman" w:cs="Times New Roman"/>
+        </w:rPr>
+      </w:pPr>
+    </w:p>
+    <w:p>
+      <w:pPr>
+        <w:rPr>
+          <w:rFonts w:ascii="Times New Roman" w:hAnsi="Times New Roman" w:cs="Times New Roman"/>
+        </w:rPr>
+      </w:pPr>
+    </w:p>
+    <w:p>
+      <w:pPr>
+        <w:rPr>
+          <w:rFonts w:ascii="Times New Roman" w:hAnsi="Times New Roman" w:cs="Times New Roman"/>
+        </w:rPr>
+      </w:pPr>
+    </w:p>
+    <w:p>
+      <w:pPr>
+        <w:rPr>
+          <w:rFonts w:ascii="Times New Roman" w:hAnsi="Times New Roman" w:cs="Times New Roman"/>
+        </w:rPr>
+      </w:pPr>
+    </w:p>
+    <w:p>
+      <w:pPr>
+        <w:rPr>
+          <w:rFonts w:ascii="Times New Roman" w:hAnsi="Times New Roman" w:cs="Times New Roman"/>
+        </w:rPr>
+      </w:pPr>
+    </w:p>
+    <w:p>
+      <w:pPr>
+        <w:rPr>
+          <w:rFonts w:ascii="Times New Roman" w:hAnsi="Times New Roman" w:cs="Times New Roman"/>
+        </w:rPr>
+      </w:pPr>
+    </w:p>
+    <w:p>
+      <w:pPr>
+        <w:rPr>
+          <w:rFonts w:ascii="Times New Roman" w:hAnsi="Times New Roman" w:cs="Times New Roman"/>
+        </w:rPr>
+      </w:pPr>
+    </w:p>
+    <w:p>
+      <w:pPr>
         <w:pStyle w:val="Heading2"/>
         <w:jc w:val="both"/>
         <w:rPr>
@@ -2741,6 +3007,7 @@
           <w:sz w:val="32"/>
           <w:szCs w:val="32"/>
         </w:rPr>
+        <w:lastRenderedPageBreak/>
         <w:t>Wildlife damage counts and rates</w:t>
       </w:r>
     </w:p>
@@ -2776,7 +3043,6 @@
           <w:bCs/>
           <w:color w:val="000000" w:themeColor="text1"/>
         </w:rPr>
-        <w:lastRenderedPageBreak/>
         <w:t>Broad and unknown groups</w:t>
       </w:r>
     </w:p>
@@ -2791,7 +3057,21 @@
         <w:rPr>
           <w:rFonts w:ascii="Times New Roman" w:hAnsi="Times New Roman" w:cs="Times New Roman"/>
         </w:rPr>
-        <w:t>Unknown bird - medium has 4,608 damage reports, followed by Unknown bird (1,631), Unknown bird - large (1,457) and Unknown bird - small (1,424). Gulls lead the broad wildlife labels with 1,167 damage reports. These are original report labels, not the analytical groups created during cleaning. They show how much damage reporting lacks exact identification.</w:t>
+        <w:t xml:space="preserve">Unknown bird - medium has 4,608 damage reports, followed by Unknown bird (1,631), Unknown bird - large (1,457) and Unknown bird - small (1,424). Gulls </w:t>
+      </w:r>
+      <w:proofErr w:type="gramStart"/>
+      <w:r>
+        <w:rPr>
+          <w:rFonts w:ascii="Times New Roman" w:hAnsi="Times New Roman" w:cs="Times New Roman"/>
+        </w:rPr>
+        <w:t>lead</w:t>
+      </w:r>
+      <w:proofErr w:type="gramEnd"/>
+      <w:r>
+        <w:rPr>
+          <w:rFonts w:ascii="Times New Roman" w:hAnsi="Times New Roman" w:cs="Times New Roman"/>
+        </w:rPr>
+        <w:t xml:space="preserve"> the broad wildlife labels with 1,167 damage reports. These are original report labels, not the analytical groups created during cleaning. They show how much damage reporting lacks exact identification.</w:t>
       </w:r>
     </w:p>
     <w:p>
@@ -3041,15 +3321,6 @@
     </w:p>
     <w:p>
       <w:pPr>
-        <w:jc w:val="both"/>
-        <w:rPr>
-          <w:rFonts w:ascii="Times New Roman" w:hAnsi="Times New Roman" w:cs="Times New Roman"/>
-          <w:szCs w:val="24"/>
-        </w:rPr>
-      </w:pPr>
-    </w:p>
-    <w:p>
-      <w:pPr>
         <w:pStyle w:val="Heading3"/>
         <w:jc w:val="both"/>
         <w:rPr>
@@ -3067,6 +3338,37 @@
           <w:color w:val="000000" w:themeColor="text1"/>
         </w:rPr>
         <w:t>Individual-species damage rates</w:t>
+      </w:r>
+    </w:p>
+    <w:p>
+      <w:pPr>
+        <w:pStyle w:val="Caption"/>
+        <w:keepNext/>
+        <w:jc w:val="center"/>
+      </w:pPr>
+      <w:r>
+        <w:t xml:space="preserve">Table </w:t>
+      </w:r>
+      <w:r>
+        <w:fldChar w:fldCharType="begin"/>
+      </w:r>
+      <w:r>
+        <w:instrText xml:space="preserve"> SEQ Table \* ARABIC </w:instrText>
+      </w:r>
+      <w:r>
+        <w:fldChar w:fldCharType="separate"/>
+      </w:r>
+      <w:r>
+        <w:rPr>
+          <w:noProof/>
+        </w:rPr>
+        <w:t>3</w:t>
+      </w:r>
+      <w:r>
+        <w:fldChar w:fldCharType="end"/>
+      </w:r>
+      <w:r>
+        <w:t>. Identified individual species damage rates</w:t>
       </w:r>
     </w:p>
     <w:tbl>
@@ -4098,7 +4400,21 @@
         <w:rPr>
           <w:rFonts w:ascii="Times New Roman" w:hAnsi="Times New Roman" w:cs="Times New Roman"/>
         </w:rPr>
-        <w:t>Waterfowl during en-route flight show rates of 77.7% in the day and 75.1% at night. These are associations within reported strikes, not causal effects of time or flight phase. Small eligible combinations still need caution; for example, Wading birds / En route / Night has only 31 reports.</w:t>
+        <w:t xml:space="preserve">Waterfowl during </w:t>
+      </w:r>
+      <w:proofErr w:type="spellStart"/>
+      <w:r>
+        <w:rPr>
+          <w:rFonts w:ascii="Times New Roman" w:hAnsi="Times New Roman" w:cs="Times New Roman"/>
+        </w:rPr>
+        <w:t>en</w:t>
+      </w:r>
+      <w:proofErr w:type="spellEnd"/>
+      <w:r>
+        <w:rPr>
+          <w:rFonts w:ascii="Times New Roman" w:hAnsi="Times New Roman" w:cs="Times New Roman"/>
+        </w:rPr>
+        <w:t>-route flight show rates of 77.7% in the day and 75.1% at night. These are associations within reported strikes, not causal effects of time or flight phase. Small eligible combinations still need caution; for example, Wading birds / En route / Night has only 31 reports.</w:t>
       </w:r>
     </w:p>
     <w:p>
@@ -4255,27 +4571,69 @@
         <w:rPr>
           <w:rFonts w:ascii="Times New Roman" w:hAnsi="Times New Roman" w:cs="Times New Roman"/>
         </w:rPr>
-        <w:t>Deer, waterfowl, and seabirds hold most of the top-ten combinations but are too infrequent to make the heatmap</w:t>
-      </w:r>
-      <w:r>
-        <w:rPr>
-          <w:rFonts w:ascii="Times New Roman" w:hAnsi="Times New Roman" w:cs="Times New Roman"/>
-        </w:rPr>
-        <w:t>. Raptors during daytime en-route flight have a 66.1% damage rate (329/498), and gulls and terns have 54.2% (96/177). Gray cells represent fewer than 30 reports, including no reports, rather than zero damage.</w:t>
-      </w:r>
-    </w:p>
-    <w:p>
-      <w:pPr>
-        <w:jc w:val="both"/>
-        <w:rPr>
-          <w:rFonts w:ascii="Times New Roman" w:hAnsi="Times New Roman" w:cs="Times New Roman"/>
-        </w:rPr>
-      </w:pPr>
-      <w:r>
-        <w:rPr>
-          <w:rFonts w:ascii="Times New Roman" w:hAnsi="Times New Roman" w:cs="Times New Roman"/>
-        </w:rPr>
-        <w:t>Unknown-bird combinations were not automatically excluded. Their highest eligible rate is 23.3% for daytime en-route flight (444/1,903), ranked 32nd overall. Many damage reports can coexist with a lower damage rate when the denominator is large.</w:t>
+        <w:t xml:space="preserve">Deer, waterfowl, and seabirds hold most of the </w:t>
+      </w:r>
+      <w:proofErr w:type="gramStart"/>
+      <w:r>
+        <w:rPr>
+          <w:rFonts w:ascii="Times New Roman" w:hAnsi="Times New Roman" w:cs="Times New Roman"/>
+        </w:rPr>
+        <w:t>top-ten</w:t>
+      </w:r>
+      <w:proofErr w:type="gramEnd"/>
+      <w:r>
+        <w:rPr>
+          <w:rFonts w:ascii="Times New Roman" w:hAnsi="Times New Roman" w:cs="Times New Roman"/>
+        </w:rPr>
+        <w:t xml:space="preserve"> combinations but are too infrequent to make the heatmap</w:t>
+      </w:r>
+      <w:r>
+        <w:rPr>
+          <w:rFonts w:ascii="Times New Roman" w:hAnsi="Times New Roman" w:cs="Times New Roman"/>
+        </w:rPr>
+        <w:t xml:space="preserve">. Raptors during daytime </w:t>
+      </w:r>
+      <w:proofErr w:type="spellStart"/>
+      <w:r>
+        <w:rPr>
+          <w:rFonts w:ascii="Times New Roman" w:hAnsi="Times New Roman" w:cs="Times New Roman"/>
+        </w:rPr>
+        <w:t>en</w:t>
+      </w:r>
+      <w:proofErr w:type="spellEnd"/>
+      <w:r>
+        <w:rPr>
+          <w:rFonts w:ascii="Times New Roman" w:hAnsi="Times New Roman" w:cs="Times New Roman"/>
+        </w:rPr>
+        <w:t>-route flight have a 66.1% damage rate (329/498), and gulls and terns have 54.2% (96/177). Gray cells represent fewer than 30 reports, including no reports, rather than zero damage.</w:t>
+      </w:r>
+    </w:p>
+    <w:p>
+      <w:pPr>
+        <w:jc w:val="both"/>
+        <w:rPr>
+          <w:rFonts w:ascii="Times New Roman" w:hAnsi="Times New Roman" w:cs="Times New Roman"/>
+        </w:rPr>
+      </w:pPr>
+      <w:r>
+        <w:rPr>
+          <w:rFonts w:ascii="Times New Roman" w:hAnsi="Times New Roman" w:cs="Times New Roman"/>
+        </w:rPr>
+        <w:t xml:space="preserve">Unknown-bird combinations were not automatically excluded. Their highest eligible rate is 23.3% for daytime </w:t>
+      </w:r>
+      <w:proofErr w:type="spellStart"/>
+      <w:r>
+        <w:rPr>
+          <w:rFonts w:ascii="Times New Roman" w:hAnsi="Times New Roman" w:cs="Times New Roman"/>
+        </w:rPr>
+        <w:t>en</w:t>
+      </w:r>
+      <w:proofErr w:type="spellEnd"/>
+      <w:r>
+        <w:rPr>
+          <w:rFonts w:ascii="Times New Roman" w:hAnsi="Times New Roman" w:cs="Times New Roman"/>
+        </w:rPr>
+        <w:t>-route flight (444/1,903), ranked 32nd overall. Many damage reports can coexist with a lower damage rate when the denominator is large.</w:t>
       </w:r>
     </w:p>
     <w:p>
@@ -4461,7 +4819,21 @@
         <w:rPr>
           <w:rFonts w:ascii="Times New Roman" w:hAnsi="Times New Roman" w:cs="Times New Roman"/>
         </w:rPr>
-        <w:t>Each airport’s score combines two equally weighted measures: its damage-rate percentile and its recent-strike-count percentile, calculated among the 663 airports with at least 20 reports. These percentiles show how an airport ranks compared with the other eligible airports, not its probability of a damaging strike. The two percentile values, expressed from 0 to 1, are averaged, multiplied by 100, and rounded to one decimal place.</w:t>
+        <w:t xml:space="preserve">Each airport’s score combines two equally weighted measures: its damage-rate percentile and its recent-strike-count percentile, calculated among the 663 airports with at least 20 reports. These percentiles show how an airport </w:t>
+      </w:r>
+      <w:proofErr w:type="gramStart"/>
+      <w:r>
+        <w:rPr>
+          <w:rFonts w:ascii="Times New Roman" w:hAnsi="Times New Roman" w:cs="Times New Roman"/>
+        </w:rPr>
+        <w:t>ranks</w:t>
+      </w:r>
+      <w:proofErr w:type="gramEnd"/>
+      <w:r>
+        <w:rPr>
+          <w:rFonts w:ascii="Times New Roman" w:hAnsi="Times New Roman" w:cs="Times New Roman"/>
+        </w:rPr>
+        <w:t xml:space="preserve"> compared with the other eligible airports, not its probability of a damaging strike. The two percentile values, expressed from 0 to 1, are averaged, multiplied by 100, and rounded to one decimal place.</w:t>
       </w:r>
     </w:p>
     <w:p>
@@ -4551,6 +4923,37 @@
           <w:rFonts w:ascii="Times New Roman" w:hAnsi="Times New Roman" w:cs="Times New Roman"/>
         </w:rPr>
       </w:pPr>
+    </w:p>
+    <w:p>
+      <w:pPr>
+        <w:pStyle w:val="Caption"/>
+        <w:keepNext/>
+        <w:jc w:val="center"/>
+      </w:pPr>
+      <w:r>
+        <w:t xml:space="preserve">Table </w:t>
+      </w:r>
+      <w:r>
+        <w:fldChar w:fldCharType="begin"/>
+      </w:r>
+      <w:r>
+        <w:instrText xml:space="preserve"> SEQ Table \* ARABIC </w:instrText>
+      </w:r>
+      <w:r>
+        <w:fldChar w:fldCharType="separate"/>
+      </w:r>
+      <w:r>
+        <w:rPr>
+          <w:noProof/>
+        </w:rPr>
+        <w:t>4</w:t>
+      </w:r>
+      <w:r>
+        <w:fldChar w:fldCharType="end"/>
+      </w:r>
+      <w:r>
+        <w:t>. Airport risk scores separated by profile</w:t>
+      </w:r>
     </w:p>
     <w:tbl>
       <w:tblPr>
@@ -4888,6 +5291,30 @@
     </w:p>
     <w:p>
       <w:pPr>
+        <w:jc w:val="both"/>
+        <w:rPr>
+          <w:rFonts w:ascii="Times New Roman" w:hAnsi="Times New Roman" w:cs="Times New Roman"/>
+        </w:rPr>
+      </w:pPr>
+    </w:p>
+    <w:p>
+      <w:pPr>
+        <w:jc w:val="both"/>
+        <w:rPr>
+          <w:rFonts w:ascii="Times New Roman" w:hAnsi="Times New Roman" w:cs="Times New Roman"/>
+        </w:rPr>
+      </w:pPr>
+    </w:p>
+    <w:p>
+      <w:pPr>
+        <w:jc w:val="both"/>
+        <w:rPr>
+          <w:rFonts w:ascii="Times New Roman" w:hAnsi="Times New Roman" w:cs="Times New Roman"/>
+        </w:rPr>
+      </w:pPr>
+    </w:p>
+    <w:p>
+      <w:pPr>
         <w:pStyle w:val="Heading3"/>
         <w:rPr>
           <w:rFonts w:ascii="Times New Roman" w:hAnsi="Times New Roman" w:cs="Times New Roman"/>
@@ -4903,7 +5330,47 @@
           <w:bCs/>
           <w:color w:val="000000" w:themeColor="text1"/>
         </w:rPr>
+        <w:lastRenderedPageBreak/>
         <w:t>Examples from the airport ranking</w:t>
+      </w:r>
+    </w:p>
+    <w:p>
+      <w:pPr>
+        <w:pStyle w:val="Caption"/>
+        <w:keepNext/>
+        <w:jc w:val="center"/>
+      </w:pPr>
+      <w:r>
+        <w:t xml:space="preserve">Table </w:t>
+      </w:r>
+      <w:r>
+        <w:fldChar w:fldCharType="begin"/>
+      </w:r>
+      <w:r>
+        <w:instrText xml:space="preserve"> SEQ Table \* ARABIC </w:instrText>
+      </w:r>
+      <w:r>
+        <w:fldChar w:fldCharType="separate"/>
+      </w:r>
+      <w:r>
+        <w:rPr>
+          <w:noProof/>
+        </w:rPr>
+        <w:t>5</w:t>
+      </w:r>
+      <w:r>
+        <w:fldChar w:fldCharType="end"/>
+      </w:r>
+      <w:r>
+        <w:t xml:space="preserve">. Example airport ranking with score and reported strikes within the last </w:t>
+      </w:r>
+      <w:proofErr w:type="gramStart"/>
+      <w:r>
+        <w:t>5 year</w:t>
+      </w:r>
+      <w:proofErr w:type="gramEnd"/>
+      <w:r>
+        <w:t xml:space="preserve"> period.</w:t>
       </w:r>
     </w:p>
     <w:tbl>
@@ -5218,7 +5685,6 @@
               <w:rPr>
                 <w:rFonts w:ascii="Times New Roman" w:hAnsi="Times New Roman" w:cs="Times New Roman"/>
               </w:rPr>
-              <w:lastRenderedPageBreak/>
               <w:t>Salt Lake City International</w:t>
             </w:r>
           </w:p>
@@ -5420,41 +5886,6 @@
           <w:t>Risk-score calculation and maps</w:t>
         </w:r>
       </w:hyperlink>
-    </w:p>
-    <w:p>
-      <w:pPr>
-        <w:rPr>
-          <w:rFonts w:ascii="Times New Roman" w:hAnsi="Times New Roman" w:cs="Times New Roman"/>
-        </w:rPr>
-      </w:pPr>
-    </w:p>
-    <w:p>
-      <w:pPr>
-        <w:rPr>
-          <w:rFonts w:ascii="Times New Roman" w:hAnsi="Times New Roman" w:cs="Times New Roman"/>
-        </w:rPr>
-      </w:pPr>
-    </w:p>
-    <w:p>
-      <w:pPr>
-        <w:rPr>
-          <w:rFonts w:ascii="Times New Roman" w:hAnsi="Times New Roman" w:cs="Times New Roman"/>
-        </w:rPr>
-      </w:pPr>
-    </w:p>
-    <w:p>
-      <w:pPr>
-        <w:rPr>
-          <w:rFonts w:ascii="Times New Roman" w:hAnsi="Times New Roman" w:cs="Times New Roman"/>
-        </w:rPr>
-      </w:pPr>
-    </w:p>
-    <w:p>
-      <w:pPr>
-        <w:rPr>
-          <w:rFonts w:ascii="Times New Roman" w:hAnsi="Times New Roman" w:cs="Times New Roman"/>
-        </w:rPr>
-      </w:pPr>
     </w:p>
     <w:p>
       <w:pPr>
@@ -5758,13 +6189,6 @@
     </w:p>
     <w:p>
       <w:pPr>
-        <w:rPr>
-          <w:rFonts w:ascii="Times New Roman" w:hAnsi="Times New Roman" w:cs="Times New Roman"/>
-        </w:rPr>
-      </w:pPr>
-    </w:p>
-    <w:p>
-      <w:pPr>
         <w:pStyle w:val="Heading3"/>
         <w:rPr>
           <w:rFonts w:ascii="Times New Roman" w:hAnsi="Times New Roman" w:cs="Times New Roman"/>
@@ -6025,7 +6449,21 @@
         <w:rPr>
           <w:rFonts w:ascii="Times New Roman" w:hAnsi="Times New Roman" w:cs="Times New Roman"/>
         </w:rPr>
-        <w:t>The target is whether a reported strike involved aircraft damage. rpart builds a decision tree using a sequence of splits; SVM separates the classes using several predictors together. Neither model predicts whether a flight will strike wildlife, and some inputs, such as species identity, may only become available after investigation.</w:t>
+        <w:t xml:space="preserve">The target is whether a reported strike involved aircraft damage. </w:t>
+      </w:r>
+      <w:proofErr w:type="spellStart"/>
+      <w:r>
+        <w:rPr>
+          <w:rFonts w:ascii="Times New Roman" w:hAnsi="Times New Roman" w:cs="Times New Roman"/>
+        </w:rPr>
+        <w:t>rpart</w:t>
+      </w:r>
+      <w:proofErr w:type="spellEnd"/>
+      <w:r>
+        <w:rPr>
+          <w:rFonts w:ascii="Times New Roman" w:hAnsi="Times New Roman" w:cs="Times New Roman"/>
+        </w:rPr>
+        <w:t xml:space="preserve"> builds a decision tree using a sequence of splits; SVM separates the classes using several predictors together. Neither model predicts whether a flight will strike wildlife, and some inputs, such as species identity, may only become available after investigation.</w:t>
       </w:r>
     </w:p>
     <w:p>
@@ -6149,6 +6587,7 @@
           <w:color w:val="000000" w:themeColor="text1"/>
         </w:rPr>
       </w:pPr>
+      <w:proofErr w:type="spellStart"/>
       <w:r>
         <w:rPr>
           <w:rFonts w:ascii="Times New Roman" w:hAnsi="Times New Roman" w:cs="Times New Roman"/>
@@ -6156,7 +6595,17 @@
           <w:bCs/>
           <w:color w:val="000000" w:themeColor="text1"/>
         </w:rPr>
-        <w:t>Rpart configuration</w:t>
+        <w:t>Rpart</w:t>
+      </w:r>
+      <w:proofErr w:type="spellEnd"/>
+      <w:r>
+        <w:rPr>
+          <w:rFonts w:ascii="Times New Roman" w:hAnsi="Times New Roman" w:cs="Times New Roman"/>
+          <w:b/>
+          <w:bCs/>
+          <w:color w:val="000000" w:themeColor="text1"/>
+        </w:rPr>
+        <w:t xml:space="preserve"> configuration</w:t>
       </w:r>
     </w:p>
     <w:p>
@@ -6261,13 +6710,23 @@
         <w:t xml:space="preserve">Source: </w:t>
       </w:r>
       <w:hyperlink r:id="rId38">
+        <w:proofErr w:type="spellStart"/>
         <w:r>
           <w:rPr>
             <w:rFonts w:ascii="Times New Roman" w:hAnsi="Times New Roman" w:cs="Times New Roman"/>
             <w:color w:val="0563C1"/>
             <w:u w:val="single"/>
           </w:rPr>
-          <w:t>rpart model</w:t>
+          <w:t>rpart</w:t>
+        </w:r>
+        <w:proofErr w:type="spellEnd"/>
+        <w:r>
+          <w:rPr>
+            <w:rFonts w:ascii="Times New Roman" w:hAnsi="Times New Roman" w:cs="Times New Roman"/>
+            <w:color w:val="0563C1"/>
+            <w:u w:val="single"/>
+          </w:rPr>
+          <w:t xml:space="preserve"> model</w:t>
         </w:r>
       </w:hyperlink>
     </w:p>
@@ -6319,6 +6778,48 @@
       </w:r>
     </w:p>
     <w:p/>
+    <w:p>
+      <w:pPr>
+        <w:pStyle w:val="Caption"/>
+        <w:keepNext/>
+        <w:jc w:val="center"/>
+      </w:pPr>
+      <w:r>
+        <w:t xml:space="preserve">Table </w:t>
+      </w:r>
+      <w:r>
+        <w:fldChar w:fldCharType="begin"/>
+      </w:r>
+      <w:r>
+        <w:instrText xml:space="preserve"> SEQ Table \* ARABIC </w:instrText>
+      </w:r>
+      <w:r>
+        <w:fldChar w:fldCharType="separate"/>
+      </w:r>
+      <w:r>
+        <w:rPr>
+          <w:noProof/>
+        </w:rPr>
+        <w:t>6</w:t>
+      </w:r>
+      <w:r>
+        <w:fldChar w:fldCharType="end"/>
+      </w:r>
+      <w:r>
+        <w:t xml:space="preserve">. </w:t>
+      </w:r>
+      <w:r>
+        <w:t xml:space="preserve">Confusion matrices for the </w:t>
+      </w:r>
+      <w:proofErr w:type="spellStart"/>
+      <w:r>
+        <w:t>rpart</w:t>
+      </w:r>
+      <w:proofErr w:type="spellEnd"/>
+      <w:r>
+        <w:t xml:space="preserve"> and SVM models on the 2024–2025 test data</w:t>
+      </w:r>
+    </w:p>
     <w:tbl>
       <w:tblPr>
         <w:tblStyle w:val="TableGrid"/>
@@ -6383,13 +6884,23 @@
                 <w:szCs w:val="18"/>
               </w:rPr>
             </w:pPr>
+            <w:proofErr w:type="spellStart"/>
             <w:r>
               <w:rPr>
                 <w:rFonts w:ascii="Times New Roman" w:hAnsi="Times New Roman" w:cs="Times New Roman"/>
                 <w:b/>
                 <w:szCs w:val="18"/>
               </w:rPr>
-              <w:t>rpart: No</w:t>
+              <w:t>rpart</w:t>
+            </w:r>
+            <w:proofErr w:type="spellEnd"/>
+            <w:r>
+              <w:rPr>
+                <w:rFonts w:ascii="Times New Roman" w:hAnsi="Times New Roman" w:cs="Times New Roman"/>
+                <w:b/>
+                <w:szCs w:val="18"/>
+              </w:rPr>
+              <w:t>: No</w:t>
             </w:r>
           </w:p>
         </w:tc>
@@ -6407,13 +6918,23 @@
                 <w:szCs w:val="18"/>
               </w:rPr>
             </w:pPr>
+            <w:proofErr w:type="spellStart"/>
             <w:r>
               <w:rPr>
                 <w:rFonts w:ascii="Times New Roman" w:hAnsi="Times New Roman" w:cs="Times New Roman"/>
                 <w:b/>
                 <w:szCs w:val="18"/>
               </w:rPr>
-              <w:t>rpart: Yes</w:t>
+              <w:t>rpart</w:t>
+            </w:r>
+            <w:proofErr w:type="spellEnd"/>
+            <w:r>
+              <w:rPr>
+                <w:rFonts w:ascii="Times New Roman" w:hAnsi="Times New Roman" w:cs="Times New Roman"/>
+                <w:b/>
+                <w:szCs w:val="18"/>
+              </w:rPr>
+              <w:t>: Yes</w:t>
             </w:r>
           </w:p>
         </w:tc>
@@ -6705,6 +7226,45 @@
           <w:szCs w:val="18"/>
         </w:rPr>
       </w:pPr>
+    </w:p>
+    <w:p>
+      <w:pPr>
+        <w:pStyle w:val="Caption"/>
+        <w:keepNext/>
+        <w:jc w:val="center"/>
+      </w:pPr>
+      <w:r>
+        <w:t xml:space="preserve">Table </w:t>
+      </w:r>
+      <w:r>
+        <w:fldChar w:fldCharType="begin"/>
+      </w:r>
+      <w:r>
+        <w:instrText xml:space="preserve"> SEQ Table \* ARABIC </w:instrText>
+      </w:r>
+      <w:r>
+        <w:fldChar w:fldCharType="separate"/>
+      </w:r>
+      <w:r>
+        <w:rPr>
+          <w:noProof/>
+        </w:rPr>
+        <w:t>7</w:t>
+      </w:r>
+      <w:r>
+        <w:fldChar w:fldCharType="end"/>
+      </w:r>
+      <w:r>
+        <w:t xml:space="preserve">. Accuracy and damage recall for </w:t>
+      </w:r>
+      <w:proofErr w:type="spellStart"/>
+      <w:r>
+        <w:t>rpart</w:t>
+      </w:r>
+      <w:proofErr w:type="spellEnd"/>
+      <w:r>
+        <w:t xml:space="preserve"> and SVM models on the 2024-2025 test data</w:t>
+      </w:r>
     </w:p>
     <w:tbl>
       <w:tblPr>
@@ -6733,7 +7293,7 @@
         <w:tc>
           <w:tcPr>
             <w:tcW w:w="5000" w:type="dxa"/>
-            <w:shd w:val="clear" w:color="auto" w:fill="F2F4F7"/>
+            <w:shd w:val="clear" w:color="auto" w:fill="D9D9D9" w:themeFill="background1" w:themeFillShade="D9"/>
             <w:vAlign w:val="center"/>
           </w:tcPr>
           <w:p>
@@ -6757,7 +7317,7 @@
         <w:tc>
           <w:tcPr>
             <w:tcW w:w="2180" w:type="dxa"/>
-            <w:shd w:val="clear" w:color="auto" w:fill="F2F4F7"/>
+            <w:shd w:val="clear" w:color="auto" w:fill="D9D9D9" w:themeFill="background1" w:themeFillShade="D9"/>
             <w:vAlign w:val="center"/>
           </w:tcPr>
           <w:p>
@@ -6768,6 +7328,7 @@
                 <w:szCs w:val="18"/>
               </w:rPr>
             </w:pPr>
+            <w:proofErr w:type="spellStart"/>
             <w:r>
               <w:rPr>
                 <w:rFonts w:ascii="Times New Roman" w:hAnsi="Times New Roman" w:cs="Times New Roman"/>
@@ -6776,12 +7337,13 @@
               </w:rPr>
               <w:t>rpart</w:t>
             </w:r>
+            <w:proofErr w:type="spellEnd"/>
           </w:p>
         </w:tc>
         <w:tc>
           <w:tcPr>
             <w:tcW w:w="2180" w:type="dxa"/>
-            <w:shd w:val="clear" w:color="auto" w:fill="F2F4F7"/>
+            <w:shd w:val="clear" w:color="auto" w:fill="D9D9D9" w:themeFill="background1" w:themeFillShade="D9"/>
             <w:vAlign w:val="center"/>
           </w:tcPr>
           <w:p>
@@ -7053,7 +7615,39 @@
           <w:rFonts w:ascii="Times New Roman" w:hAnsi="Times New Roman" w:cs="Times New Roman"/>
           <w:szCs w:val="24"/>
         </w:rPr>
-        <w:t>The rpart model achieved a balanced accuracy of 72.28%, compared with 68.51% for SVM. Although SVM had higher overall accuracy, rpart performed better when both outcomes were given equal importance.</w:t>
+        <w:t xml:space="preserve">The </w:t>
+      </w:r>
+      <w:proofErr w:type="spellStart"/>
+      <w:r>
+        <w:rPr>
+          <w:rFonts w:ascii="Times New Roman" w:hAnsi="Times New Roman" w:cs="Times New Roman"/>
+          <w:szCs w:val="24"/>
+        </w:rPr>
+        <w:t>rpart</w:t>
+      </w:r>
+      <w:proofErr w:type="spellEnd"/>
+      <w:r>
+        <w:rPr>
+          <w:rFonts w:ascii="Times New Roman" w:hAnsi="Times New Roman" w:cs="Times New Roman"/>
+          <w:szCs w:val="24"/>
+        </w:rPr>
+        <w:t xml:space="preserve"> model achieved a balanced accuracy of 72.28%, compared with 68.51% for SVM. Although SVM had higher overall accuracy, </w:t>
+      </w:r>
+      <w:proofErr w:type="spellStart"/>
+      <w:r>
+        <w:rPr>
+          <w:rFonts w:ascii="Times New Roman" w:hAnsi="Times New Roman" w:cs="Times New Roman"/>
+          <w:szCs w:val="24"/>
+        </w:rPr>
+        <w:t>rpart</w:t>
+      </w:r>
+      <w:proofErr w:type="spellEnd"/>
+      <w:r>
+        <w:rPr>
+          <w:rFonts w:ascii="Times New Roman" w:hAnsi="Times New Roman" w:cs="Times New Roman"/>
+          <w:szCs w:val="24"/>
+        </w:rPr>
+        <w:t xml:space="preserve"> performed better when both outcomes were given equal importance.</w:t>
       </w:r>
     </w:p>
     <w:p/>
@@ -7133,7 +7727,15 @@
         <w:t xml:space="preserve">. </w:t>
       </w:r>
       <w:r>
-        <w:t xml:space="preserve">Final rpart tree. </w:t>
+        <w:t xml:space="preserve">Final </w:t>
+      </w:r>
+      <w:proofErr w:type="spellStart"/>
+      <w:r>
+        <w:t>rpart</w:t>
+      </w:r>
+      <w:proofErr w:type="spellEnd"/>
+      <w:r>
+        <w:t xml:space="preserve"> tree. </w:t>
       </w:r>
     </w:p>
     <w:p>
@@ -7157,11 +7759,33 @@
           <w:rFonts w:ascii="Times New Roman" w:hAnsi="Times New Roman" w:cs="Times New Roman"/>
         </w:rPr>
       </w:pPr>
-      <w:r>
-        <w:rPr>
-          <w:rFonts w:ascii="Times New Roman" w:hAnsi="Times New Roman" w:cs="Times New Roman"/>
-        </w:rPr>
-        <w:t>rpart detects 992 of 1,726 damaging test strikes, while SVM detects 738. rpart catches more damage but raises more false alarms. SVM has higher accuracy but misses more damaging strikes. An always-No model would be 96.31% accurate because 45,103 test reports have no damage, yet it would detect none of the damaging reports. This is why overall accuracy alone is misleading.</w:t>
+      <w:proofErr w:type="spellStart"/>
+      <w:r>
+        <w:rPr>
+          <w:rFonts w:ascii="Times New Roman" w:hAnsi="Times New Roman" w:cs="Times New Roman"/>
+        </w:rPr>
+        <w:t>rpart</w:t>
+      </w:r>
+      <w:proofErr w:type="spellEnd"/>
+      <w:r>
+        <w:rPr>
+          <w:rFonts w:ascii="Times New Roman" w:hAnsi="Times New Roman" w:cs="Times New Roman"/>
+        </w:rPr>
+        <w:t xml:space="preserve"> detects 992 of 1,726 damaging test strikes, while SVM detects 738. </w:t>
+      </w:r>
+      <w:proofErr w:type="spellStart"/>
+      <w:r>
+        <w:rPr>
+          <w:rFonts w:ascii="Times New Roman" w:hAnsi="Times New Roman" w:cs="Times New Roman"/>
+        </w:rPr>
+        <w:t>rpart</w:t>
+      </w:r>
+      <w:proofErr w:type="spellEnd"/>
+      <w:r>
+        <w:rPr>
+          <w:rFonts w:ascii="Times New Roman" w:hAnsi="Times New Roman" w:cs="Times New Roman"/>
+        </w:rPr>
+        <w:t xml:space="preserve"> catches more damage but raises more false alarms. SVM has higher accuracy but misses more damaging strikes. An always-No model would be 96.31% accurate because 45,103 test reports have no damage, yet it would detect none of the damaging reports. This is why overall accuracy alone is misleading.</w:t>
       </w:r>
     </w:p>
     <w:p>
@@ -7410,7 +8034,21 @@
         <w:rPr>
           <w:rFonts w:ascii="Times New Roman" w:hAnsi="Times New Roman" w:cs="Times New Roman"/>
         </w:rPr>
-        <w:t>Unknown species, remaining grouping errors and approximate time-of-day filling affect interpretation. The grouping review covered common labels and 177 unmatched labels, not an independent audit of all 974. The lookup makes the choices visible and repeatable, but does not eliminate uncertainty.</w:t>
+        <w:t xml:space="preserve">Unknown species, remaining grouping errors and approximate time-of-day filling affect interpretation. The grouping review covered common labels and 177 unmatched labels, not an independent audit of all 974. The lookup makes the choices visible and </w:t>
+      </w:r>
+      <w:proofErr w:type="gramStart"/>
+      <w:r>
+        <w:rPr>
+          <w:rFonts w:ascii="Times New Roman" w:hAnsi="Times New Roman" w:cs="Times New Roman"/>
+        </w:rPr>
+        <w:t>repeatable, but</w:t>
+      </w:r>
+      <w:proofErr w:type="gramEnd"/>
+      <w:r>
+        <w:rPr>
+          <w:rFonts w:ascii="Times New Roman" w:hAnsi="Times New Roman" w:cs="Times New Roman"/>
+        </w:rPr>
+        <w:t xml:space="preserve"> does not eliminate uncertainty.</w:t>
       </w:r>
     </w:p>
     <w:p>
@@ -7509,19 +8147,19 @@
         <w:rPr>
           <w:rFonts w:ascii="Times New Roman" w:hAnsi="Times New Roman" w:cs="Times New Roman"/>
         </w:rPr>
-        <w:t xml:space="preserve"> Examine high</w:t>
-      </w:r>
-      <w:r>
-        <w:rPr>
-          <w:rFonts w:ascii="Times New Roman" w:hAnsi="Times New Roman" w:cs="Times New Roman"/>
-        </w:rPr>
-        <w:t>-</w:t>
-      </w:r>
-      <w:r>
-        <w:rPr>
-          <w:rFonts w:ascii="Times New Roman" w:hAnsi="Times New Roman" w:cs="Times New Roman"/>
-        </w:rPr>
-        <w:t>scoring airports and the Eastern and Southern regions more closely. Treat the scores as a starting point rather than an allocation formula. Half of each score is recent reporting volume, so busy airports and regions tend to rank high by construction. Local conditions, traffic levels, and reporting effort should inform any decision before resources are assigned by rank.</w:t>
+        <w:t xml:space="preserve"> </w:t>
+      </w:r>
+      <w:r>
+        <w:rPr>
+          <w:rFonts w:ascii="Times New Roman" w:hAnsi="Times New Roman" w:cs="Times New Roman"/>
+        </w:rPr>
+        <w:t>Prioritize high-scoring airports and the Eastern and Southern FAA regions for further assessment of wildlife hazards and mitigation needs.</w:t>
+      </w:r>
+      <w:r>
+        <w:rPr>
+          <w:rFonts w:ascii="Times New Roman" w:hAnsi="Times New Roman" w:cs="Times New Roman"/>
+        </w:rPr>
+        <w:t xml:space="preserve"> Half of each score is recent reporting volume, so busy airports and regions tend to rank high by construction. Local conditions, traffic levels, and reporting effort should inform any decision before resources are assigned by rank.</w:t>
       </w:r>
     </w:p>
     <w:p>
@@ -7754,7 +8392,35 @@
         <w:rPr>
           <w:rFonts w:ascii="Times New Roman" w:hAnsi="Times New Roman" w:cs="Times New Roman"/>
         </w:rPr>
-        <w:t>White-tailed deer have the most damage reports among named species, while mule deer have the highest eligible named-species damage rate. Deer account for six of the ten highest-rate group, phase and time combinations; nighttime arrival leads at 86.5%. Among the five most-reported groups shown in the heatmap, daytime en-route strikes involving raptors and gulls/terns stand out. Deer are absent from that heatmap because selection is based on report volume, not damage rate.</w:t>
+        <w:t xml:space="preserve">White-tailed deer have the most damage reports among named species, while mule deer have the highest eligible named-species damage rate. Deer </w:t>
+      </w:r>
+      <w:proofErr w:type="gramStart"/>
+      <w:r>
+        <w:rPr>
+          <w:rFonts w:ascii="Times New Roman" w:hAnsi="Times New Roman" w:cs="Times New Roman"/>
+        </w:rPr>
+        <w:t>account</w:t>
+      </w:r>
+      <w:proofErr w:type="gramEnd"/>
+      <w:r>
+        <w:rPr>
+          <w:rFonts w:ascii="Times New Roman" w:hAnsi="Times New Roman" w:cs="Times New Roman"/>
+        </w:rPr>
+        <w:t xml:space="preserve"> for six of the ten highest-rate group, phase and time combinations; nighttime arrival leads at 86.5%. Among the five most-reported groups shown in the heatmap, daytime </w:t>
+      </w:r>
+      <w:proofErr w:type="spellStart"/>
+      <w:r>
+        <w:rPr>
+          <w:rFonts w:ascii="Times New Roman" w:hAnsi="Times New Roman" w:cs="Times New Roman"/>
+        </w:rPr>
+        <w:t>en</w:t>
+      </w:r>
+      <w:proofErr w:type="spellEnd"/>
+      <w:r>
+        <w:rPr>
+          <w:rFonts w:ascii="Times New Roman" w:hAnsi="Times New Roman" w:cs="Times New Roman"/>
+        </w:rPr>
+        <w:t>-route strikes involving raptors and gulls/terns stand out. Deer are absent from that heatmap because selection is based on report volume, not damage rate.</w:t>
       </w:r>
     </w:p>
     <w:p>
@@ -7794,7 +8460,35 @@
         <w:rPr>
           <w:rFonts w:ascii="Times New Roman" w:hAnsi="Times New Roman" w:cs="Times New Roman"/>
         </w:rPr>
-        <w:t>The models identify some damaging strikes, but neither is reliable enough to use alone for operational decisions. On the same 2024-2025 test records, rpart detects 57.5% of damaging strikes and SVM detects 42.8%. SVM has higher overall accuracy and fewer false alarms; rpart detects more damage. Class imbalance, missing information and wildlife identities learned after an incident limit how these results should be used.</w:t>
+        <w:t xml:space="preserve">The models identify some damaging strikes, but neither is reliable enough to use alone for operational decisions. On the same 2024-2025 test records, </w:t>
+      </w:r>
+      <w:proofErr w:type="spellStart"/>
+      <w:r>
+        <w:rPr>
+          <w:rFonts w:ascii="Times New Roman" w:hAnsi="Times New Roman" w:cs="Times New Roman"/>
+        </w:rPr>
+        <w:t>rpart</w:t>
+      </w:r>
+      <w:proofErr w:type="spellEnd"/>
+      <w:r>
+        <w:rPr>
+          <w:rFonts w:ascii="Times New Roman" w:hAnsi="Times New Roman" w:cs="Times New Roman"/>
+        </w:rPr>
+        <w:t xml:space="preserve"> detects 57.5% of damaging strikes and SVM detects 42.8%. SVM has higher overall accuracy and fewer false alarms; </w:t>
+      </w:r>
+      <w:proofErr w:type="spellStart"/>
+      <w:r>
+        <w:rPr>
+          <w:rFonts w:ascii="Times New Roman" w:hAnsi="Times New Roman" w:cs="Times New Roman"/>
+        </w:rPr>
+        <w:t>rpart</w:t>
+      </w:r>
+      <w:proofErr w:type="spellEnd"/>
+      <w:r>
+        <w:rPr>
+          <w:rFonts w:ascii="Times New Roman" w:hAnsi="Times New Roman" w:cs="Times New Roman"/>
+        </w:rPr>
+        <w:t xml:space="preserve"> detects more damage. Class imbalance, missing information and wildlife identities learned after an incident limit how these results should be used.</w:t>
       </w:r>
     </w:p>
     <w:p/>
@@ -7865,30 +8559,56 @@
         <w:rPr>
           <w:rFonts w:ascii="Times New Roman" w:hAnsi="Times New Roman" w:cs="Times New Roman"/>
         </w:rPr>
-        <w:t xml:space="preserve"> https://wildlife.faa.gov/home. The local FAA export, rather than a newly downloaded dataset, is the basis of the analysis.</w:t>
-      </w:r>
-    </w:p>
-    <w:p>
-      <w:pPr>
-        <w:rPr>
-          <w:rFonts w:ascii="Times New Roman" w:hAnsi="Times New Roman" w:cs="Times New Roman"/>
-        </w:rPr>
-      </w:pPr>
+        <w:t xml:space="preserve"> </w:t>
+      </w:r>
+      <w:hyperlink r:id="rId42" w:history="1">
+        <w:r>
+          <w:rPr>
+            <w:rStyle w:val="Hyperlink"/>
+            <w:rFonts w:ascii="Times New Roman" w:hAnsi="Times New Roman" w:cs="Times New Roman"/>
+          </w:rPr>
+          <w:t>https://wildlife.faa.gov/home</w:t>
+        </w:r>
+      </w:hyperlink>
+      <w:r>
+        <w:rPr>
+          <w:rFonts w:ascii="Times New Roman" w:hAnsi="Times New Roman" w:cs="Times New Roman"/>
+        </w:rPr>
+        <w:t>. The local FAA export, rather than a newly downloaded dataset, is the basis of the analysis.</w:t>
+      </w:r>
+    </w:p>
+    <w:p>
+      <w:pPr>
+        <w:jc w:val="both"/>
+        <w:rPr>
+          <w:rFonts w:ascii="Times New Roman" w:hAnsi="Times New Roman" w:cs="Times New Roman"/>
+        </w:rPr>
+      </w:pPr>
+    </w:p>
+    <w:p>
+      <w:pPr>
+        <w:rPr>
+          <w:rStyle w:val="Hyperlink"/>
+          <w:rFonts w:ascii="Times New Roman" w:hAnsi="Times New Roman" w:cs="Times New Roman"/>
+        </w:rPr>
+      </w:pPr>
+      <w:proofErr w:type="spellStart"/>
       <w:r>
         <w:rPr>
           <w:rFonts w:ascii="Times New Roman" w:hAnsi="Times New Roman" w:cs="Times New Roman"/>
           <w:b/>
           <w:bCs/>
         </w:rPr>
-        <w:t>BirdCast (Cornell Lab)</w:t>
-      </w:r>
+        <w:t>BirdCast</w:t>
+      </w:r>
+      <w:proofErr w:type="spellEnd"/>
       <w:r>
         <w:rPr>
           <w:rFonts w:ascii="Times New Roman" w:hAnsi="Times New Roman" w:cs="Times New Roman"/>
           <w:b/>
           <w:bCs/>
         </w:rPr>
-        <w:t xml:space="preserve"> / All about birds</w:t>
+        <w:t xml:space="preserve"> (Cornell Lab)</w:t>
       </w:r>
       <w:r>
         <w:rPr>
@@ -7896,6 +8616,14 @@
           <w:b/>
           <w:bCs/>
         </w:rPr>
+        <w:t xml:space="preserve"> / All about birds</w:t>
+      </w:r>
+      <w:r>
+        <w:rPr>
+          <w:rFonts w:ascii="Times New Roman" w:hAnsi="Times New Roman" w:cs="Times New Roman"/>
+          <w:b/>
+          <w:bCs/>
+        </w:rPr>
         <w:t>:</w:t>
       </w:r>
       <w:r>
@@ -7904,11 +8632,19 @@
         </w:rPr>
         <w:t xml:space="preserve"> </w:t>
       </w:r>
-      <w:r>
-        <w:rPr>
-          <w:rFonts w:ascii="Times New Roman" w:hAnsi="Times New Roman" w:cs="Times New Roman"/>
-        </w:rPr>
-        <w:t>BirdCast describes most nocturnal spring migration as occurring from mid-March to mid-June and fall migration from mid-August to mid-November</w:t>
+      <w:proofErr w:type="spellStart"/>
+      <w:r>
+        <w:rPr>
+          <w:rFonts w:ascii="Times New Roman" w:hAnsi="Times New Roman" w:cs="Times New Roman"/>
+        </w:rPr>
+        <w:t>BirdCast</w:t>
+      </w:r>
+      <w:proofErr w:type="spellEnd"/>
+      <w:r>
+        <w:rPr>
+          <w:rFonts w:ascii="Times New Roman" w:hAnsi="Times New Roman" w:cs="Times New Roman"/>
+        </w:rPr>
+        <w:t xml:space="preserve"> describes most nocturnal spring migration as occurring from mid-March to mid-June and fall migration from mid-August to mid-November</w:t>
       </w:r>
       <w:r>
         <w:rPr>
@@ -7922,7 +8658,7 @@
         </w:rPr>
         <w:t xml:space="preserve"> </w:t>
       </w:r>
-      <w:hyperlink r:id="rId42" w:history="1">
+      <w:hyperlink r:id="rId43" w:history="1">
         <w:r>
           <w:rPr>
             <w:rStyle w:val="Hyperlink"/>
@@ -7937,7 +8673,7 @@
         </w:rPr>
         <w:t xml:space="preserve"> </w:t>
       </w:r>
-      <w:hyperlink r:id="rId43" w:history="1">
+      <w:hyperlink r:id="rId44" w:history="1">
         <w:r>
           <w:rPr>
             <w:rStyle w:val="Hyperlink"/>
@@ -7953,6 +8689,13 @@
           <w:rFonts w:ascii="Times New Roman" w:hAnsi="Times New Roman" w:cs="Times New Roman"/>
         </w:rPr>
       </w:pPr>
+    </w:p>
+    <w:p>
+      <w:pPr>
+        <w:rPr>
+          <w:rFonts w:ascii="Times New Roman" w:hAnsi="Times New Roman" w:cs="Times New Roman"/>
+        </w:rPr>
+      </w:pPr>
       <w:r>
         <w:rPr>
           <w:rFonts w:ascii="Times New Roman" w:hAnsi="Times New Roman" w:cs="Times New Roman"/>
@@ -7981,7 +8724,22 @@
         <w:rPr>
           <w:rFonts w:ascii="Times New Roman" w:hAnsi="Times New Roman" w:cs="Times New Roman"/>
         </w:rPr>
-        <w:t xml:space="preserve"> https://www.faa.gov/airports/airport_safety/wildlife/smithsonian. This describes identification using feathers and DNA-bearing remains</w:t>
+        <w:t xml:space="preserve"> </w:t>
+      </w:r>
+      <w:hyperlink r:id="rId45" w:history="1">
+        <w:r>
+          <w:rPr>
+            <w:rStyle w:val="Hyperlink"/>
+            <w:rFonts w:ascii="Times New Roman" w:hAnsi="Times New Roman" w:cs="Times New Roman"/>
+          </w:rPr>
+          <w:t>https://www.faa.gov/airports/airport_safety/wildlife/smithsonian</w:t>
+        </w:r>
+      </w:hyperlink>
+      <w:r>
+        <w:rPr>
+          <w:rFonts w:ascii="Times New Roman" w:hAnsi="Times New Roman" w:cs="Times New Roman"/>
+        </w:rPr>
+        <w:t>. This describes identification using feathers and DNA-bearing remains</w:t>
       </w:r>
       <w:r>
         <w:rPr>
@@ -7996,9 +8754,18 @@
           <w:rFonts w:ascii="Times New Roman" w:hAnsi="Times New Roman" w:cs="Times New Roman"/>
         </w:rPr>
       </w:pPr>
-      <w:r>
-        <w:rPr>
-          <w:rFonts w:ascii="Times New Roman" w:hAnsi="Times New Roman" w:cs="Times New Roman"/>
+    </w:p>
+    <w:p>
+      <w:pPr>
+        <w:rPr>
+          <w:rFonts w:ascii="Times New Roman" w:hAnsi="Times New Roman" w:cs="Times New Roman"/>
+        </w:rPr>
+      </w:pPr>
+      <w:r>
+        <w:rPr>
+          <w:rFonts w:ascii="Times New Roman" w:hAnsi="Times New Roman" w:cs="Times New Roman"/>
+          <w:b/>
+          <w:bCs/>
         </w:rPr>
         <w:t>Species lookup conventions and reference links are recorded in</w:t>
       </w:r>
@@ -8011,9 +8778,24 @@
       <w:r>
         <w:rPr>
           <w:rFonts w:ascii="Times New Roman" w:hAnsi="Times New Roman" w:cs="Times New Roman"/>
-        </w:rPr>
-        <w:t>data/reference/species_group_lookup_notes.md. Sources include Cornell Lab of Ornithology species/family accounts, Animal Diversity Web and the Mammal Diversity Database. Migration month ranges remain analyst-defined approximations rather than exact dates for every species or location.</w:t>
-      </w:r>
+          <w:b/>
+          <w:bCs/>
+        </w:rPr>
+        <w:t>data/reference/species_group_lookup_notes.md</w:t>
+      </w:r>
+      <w:r>
+        <w:rPr>
+          <w:rFonts w:ascii="Times New Roman" w:hAnsi="Times New Roman" w:cs="Times New Roman"/>
+        </w:rPr>
+        <w:t>. Sources include Cornell Lab of Ornithology species/family accounts, Animal Diversity Web and the Mammal Diversity Database. Migration month ranges remain analyst-defined approximations rather than exact dates for every species or location.</w:t>
+      </w:r>
+    </w:p>
+    <w:p>
+      <w:pPr>
+        <w:rPr>
+          <w:rFonts w:ascii="Times New Roman" w:hAnsi="Times New Roman" w:cs="Times New Roman"/>
+        </w:rPr>
+      </w:pPr>
     </w:p>
     <w:p>
       <w:pPr>
@@ -8052,14 +8834,6 @@
     </w:p>
     <w:p>
       <w:pPr>
-        <w:jc w:val="both"/>
-        <w:rPr>
-          <w:rFonts w:ascii="Times New Roman" w:hAnsi="Times New Roman" w:cs="Times New Roman"/>
-        </w:rPr>
-      </w:pPr>
-    </w:p>
-    <w:p>
-      <w:pPr>
         <w:pStyle w:val="Caption"/>
         <w:jc w:val="both"/>
         <w:rPr>
@@ -8072,7 +8846,7 @@
         </w:rPr>
         <w:t xml:space="preserve">Source: </w:t>
       </w:r>
-      <w:hyperlink r:id="rId44">
+      <w:hyperlink r:id="rId46">
         <w:r>
           <w:rPr>
             <w:rFonts w:ascii="Times New Roman" w:hAnsi="Times New Roman" w:cs="Times New Roman"/>
@@ -8097,7 +8871,7 @@
         </w:rPr>
         <w:t xml:space="preserve">Source: </w:t>
       </w:r>
-      <w:hyperlink r:id="rId45">
+      <w:hyperlink r:id="rId47">
         <w:r>
           <w:rPr>
             <w:rFonts w:ascii="Times New Roman" w:hAnsi="Times New Roman" w:cs="Times New Roman"/>
@@ -8114,6 +8888,8 @@
         <w:jc w:val="both"/>
         <w:rPr>
           <w:rFonts w:ascii="Times New Roman" w:hAnsi="Times New Roman" w:cs="Times New Roman"/>
+          <w:color w:val="0563C1"/>
+          <w:u w:val="single"/>
         </w:rPr>
       </w:pPr>
       <w:r>
@@ -8122,7 +8898,7 @@
         </w:rPr>
         <w:t xml:space="preserve">Source: </w:t>
       </w:r>
-      <w:hyperlink r:id="rId46">
+      <w:hyperlink r:id="rId48">
         <w:r>
           <w:rPr>
             <w:rFonts w:ascii="Times New Roman" w:hAnsi="Times New Roman" w:cs="Times New Roman"/>
@@ -8133,14 +8909,7 @@
         </w:r>
       </w:hyperlink>
     </w:p>
-    <w:p>
-      <w:pPr>
-        <w:jc w:val="both"/>
-        <w:rPr>
-          <w:rFonts w:ascii="Times New Roman" w:hAnsi="Times New Roman" w:cs="Times New Roman"/>
-        </w:rPr>
-      </w:pPr>
-    </w:p>
+    <w:p/>
     <w:p>
       <w:pPr>
         <w:pStyle w:val="Heading3"/>
@@ -8177,9 +8946,9 @@
       </w:r>
     </w:p>
     <w:sectPr>
-      <w:headerReference w:type="even" r:id="rId47"/>
-      <w:headerReference w:type="default" r:id="rId48"/>
-      <w:footerReference w:type="default" r:id="rId49"/>
+      <w:headerReference w:type="even" r:id="rId49"/>
+      <w:headerReference w:type="default" r:id="rId50"/>
+      <w:footerReference w:type="default" r:id="rId51"/>
       <w:pgSz w:w="12240" w:h="15840" w:code="1"/>
       <w:pgMar w:top="1440" w:right="1152" w:bottom="720" w:left="1152" w:header="432" w:footer="144" w:gutter="0"/>
       <w:cols w:space="720"/>
@@ -11407,26 +12176,6 @@
 </file>
 
 <file path=customXml/item1.xml><?xml version="1.0" encoding="utf-8"?>
-<p:properties xmlns:p="http://schemas.microsoft.com/office/2006/metadata/properties" xmlns:xsi="http://www.w3.org/2001/XMLSchema-instance" xmlns:pc="http://schemas.microsoft.com/office/infopath/2007/PartnerControls">
-  <documentManagement>
-    <_ip_UnifiedCompliancePolicyUIAction xmlns="http://schemas.microsoft.com/sharepoint/v3" xsi:nil="true"/>
-    <Image xmlns="71af3243-3dd4-4a8d-8c0d-dd76da1f02a5">
-      <Url xsi:nil="true"/>
-      <Description xsi:nil="true"/>
-    </Image>
-    <Status xmlns="71af3243-3dd4-4a8d-8c0d-dd76da1f02a5">Not started</Status>
-    <Background xmlns="71af3243-3dd4-4a8d-8c0d-dd76da1f02a5">false</Background>
-    <_ip_UnifiedCompliancePolicyProperties xmlns="http://schemas.microsoft.com/sharepoint/v3" xsi:nil="true"/>
-    <ImageTagsTaxHTField xmlns="71af3243-3dd4-4a8d-8c0d-dd76da1f02a5">
-      <Terms xmlns="http://schemas.microsoft.com/office/infopath/2007/PartnerControls"/>
-    </ImageTagsTaxHTField>
-    <TaxCatchAll xmlns="230e9df3-be65-4c73-a93b-d1236ebd677e" xsi:nil="true"/>
-    <MediaServiceKeyPoints xmlns="71af3243-3dd4-4a8d-8c0d-dd76da1f02a5" xsi:nil="true"/>
-  </documentManagement>
-</p:properties>
-</file>
-
-<file path=customXml/item2.xml><?xml version="1.0" encoding="utf-8"?>
 <ct:contentTypeSchema xmlns:ct="http://schemas.microsoft.com/office/2006/metadata/contentType" xmlns:ma="http://schemas.microsoft.com/office/2006/metadata/properties/metaAttributes" ct:_="" ma:_="" ma:contentTypeName="Document" ma:contentTypeID="0x01010079F111ED35F8CC479449609E8A0923A6" ma:contentTypeVersion="30" ma:contentTypeDescription="Create a new document." ma:contentTypeScope="" ma:versionID="cec0622158e8f13124e9e8fd4de31bd1">
   <xsd:schema xmlns:xsd="http://www.w3.org/2001/XMLSchema" xmlns:xs="http://www.w3.org/2001/XMLSchema" xmlns:p="http://schemas.microsoft.com/office/2006/metadata/properties" xmlns:ns1="http://schemas.microsoft.com/sharepoint/v3" xmlns:ns2="71af3243-3dd4-4a8d-8c0d-dd76da1f02a5" xmlns:ns3="16c05727-aa75-4e4a-9b5f-8a80a1165891" xmlns:ns4="230e9df3-be65-4c73-a93b-d1236ebd677e" targetNamespace="http://schemas.microsoft.com/office/2006/metadata/properties" ma:root="true" ma:fieldsID="3b52f30ab005d15df08657af532e6e38" ns1:_="" ns2:_="" ns3:_="" ns4:_="">
     <xsd:import namespace="http://schemas.microsoft.com/sharepoint/v3"/>
@@ -11744,6 +12493,10 @@
 </ct:contentTypeSchema>
 </file>
 
+<file path=customXml/item2.xml><?xml version="1.0" encoding="utf-8"?>
+<b:Sources xmlns:b="http://schemas.openxmlformats.org/officeDocument/2006/bibliography" xmlns="http://schemas.openxmlformats.org/officeDocument/2006/bibliography" SelectedStyle="\APASixthEditionOfficeOnline.xsl" StyleName="APA" Version="6"/>
+</file>
+
 <file path=customXml/item3.xml><?xml version="1.0" encoding="utf-8"?>
 <?mso-contentType ?>
 <FormTemplates xmlns="http://schemas.microsoft.com/sharepoint/v3/contenttype/forms">
@@ -11754,22 +12507,26 @@
 </file>
 
 <file path=customXml/item4.xml><?xml version="1.0" encoding="utf-8"?>
-<b:Sources xmlns:b="http://schemas.openxmlformats.org/officeDocument/2006/bibliography" xmlns="http://schemas.openxmlformats.org/officeDocument/2006/bibliography" SelectedStyle="\APASixthEditionOfficeOnline.xsl" StyleName="APA" Version="6"/>
+<p:properties xmlns:p="http://schemas.microsoft.com/office/2006/metadata/properties" xmlns:xsi="http://www.w3.org/2001/XMLSchema-instance" xmlns:pc="http://schemas.microsoft.com/office/infopath/2007/PartnerControls">
+  <documentManagement>
+    <_ip_UnifiedCompliancePolicyUIAction xmlns="http://schemas.microsoft.com/sharepoint/v3" xsi:nil="true"/>
+    <Image xmlns="71af3243-3dd4-4a8d-8c0d-dd76da1f02a5">
+      <Url xsi:nil="true"/>
+      <Description xsi:nil="true"/>
+    </Image>
+    <Status xmlns="71af3243-3dd4-4a8d-8c0d-dd76da1f02a5">Not started</Status>
+    <Background xmlns="71af3243-3dd4-4a8d-8c0d-dd76da1f02a5">false</Background>
+    <_ip_UnifiedCompliancePolicyProperties xmlns="http://schemas.microsoft.com/sharepoint/v3" xsi:nil="true"/>
+    <ImageTagsTaxHTField xmlns="71af3243-3dd4-4a8d-8c0d-dd76da1f02a5">
+      <Terms xmlns="http://schemas.microsoft.com/office/infopath/2007/PartnerControls"/>
+    </ImageTagsTaxHTField>
+    <TaxCatchAll xmlns="230e9df3-be65-4c73-a93b-d1236ebd677e" xsi:nil="true"/>
+    <MediaServiceKeyPoints xmlns="71af3243-3dd4-4a8d-8c0d-dd76da1f02a5" xsi:nil="true"/>
+  </documentManagement>
+</p:properties>
 </file>
 
 <file path=customXml/itemProps1.xml><?xml version="1.0" encoding="utf-8"?>
-<ds:datastoreItem xmlns:ds="http://schemas.openxmlformats.org/officeDocument/2006/customXml" ds:itemID="{27A94286-1488-4B05-BE05-620B873327F0}">
-  <ds:schemaRefs>
-    <ds:schemaRef ds:uri="http://schemas.microsoft.com/office/2006/metadata/properties"/>
-    <ds:schemaRef ds:uri="http://schemas.microsoft.com/office/infopath/2007/PartnerControls"/>
-    <ds:schemaRef ds:uri="http://schemas.microsoft.com/sharepoint/v3"/>
-    <ds:schemaRef ds:uri="71af3243-3dd4-4a8d-8c0d-dd76da1f02a5"/>
-    <ds:schemaRef ds:uri="230e9df3-be65-4c73-a93b-d1236ebd677e"/>
-  </ds:schemaRefs>
-</ds:datastoreItem>
-</file>
-
-<file path=customXml/itemProps2.xml><?xml version="1.0" encoding="utf-8"?>
 <ds:datastoreItem xmlns:ds="http://schemas.openxmlformats.org/officeDocument/2006/customXml" ds:itemID="{8AA05782-1956-4ABD-9469-5855286A5A27}">
   <ds:schemaRefs>
     <ds:schemaRef ds:uri="http://schemas.microsoft.com/office/2006/metadata/contentType"/>
@@ -11790,6 +12547,14 @@
 </ds:datastoreItem>
 </file>
 
+<file path=customXml/itemProps2.xml><?xml version="1.0" encoding="utf-8"?>
+<ds:datastoreItem xmlns:ds="http://schemas.openxmlformats.org/officeDocument/2006/customXml" ds:itemID="{A87DB213-1182-4C1A-8B77-DBF00BD164E1}">
+  <ds:schemaRefs>
+    <ds:schemaRef ds:uri="http://schemas.openxmlformats.org/officeDocument/2006/bibliography"/>
+  </ds:schemaRefs>
+</ds:datastoreItem>
+</file>
+
 <file path=customXml/itemProps3.xml><?xml version="1.0" encoding="utf-8"?>
 <ds:datastoreItem xmlns:ds="http://schemas.openxmlformats.org/officeDocument/2006/customXml" ds:itemID="{5FCA0720-E518-4C54-8EC1-2FF547E897F0}">
   <ds:schemaRefs>
@@ -11799,9 +12564,13 @@
 </file>
 
 <file path=customXml/itemProps4.xml><?xml version="1.0" encoding="utf-8"?>
-<ds:datastoreItem xmlns:ds="http://schemas.openxmlformats.org/officeDocument/2006/customXml" ds:itemID="{A87DB213-1182-4C1A-8B77-DBF00BD164E1}">
+<ds:datastoreItem xmlns:ds="http://schemas.openxmlformats.org/officeDocument/2006/customXml" ds:itemID="{27A94286-1488-4B05-BE05-620B873327F0}">
   <ds:schemaRefs>
-    <ds:schemaRef ds:uri="http://schemas.openxmlformats.org/officeDocument/2006/bibliography"/>
+    <ds:schemaRef ds:uri="http://schemas.microsoft.com/office/2006/metadata/properties"/>
+    <ds:schemaRef ds:uri="http://schemas.microsoft.com/office/infopath/2007/PartnerControls"/>
+    <ds:schemaRef ds:uri="http://schemas.microsoft.com/sharepoint/v3"/>
+    <ds:schemaRef ds:uri="71af3243-3dd4-4a8d-8c0d-dd76da1f02a5"/>
+    <ds:schemaRef ds:uri="230e9df3-be65-4c73-a93b-d1236ebd677e"/>
   </ds:schemaRefs>
 </ds:datastoreItem>
 </file>

</xml_diff>